<commit_message>
Hinweis auf Hardware von Der RC-Modellbauer (Ziege-One) mit Links
Co-Authored-By: Claude Opus 5.5 (1M context) <noreply@anthropic.com>
Claude-Session: https://claude.ai/code/session_014EkU4tYXw8dgAHqd2AZ5g9
</commit_message>
<xml_diff>
--- a/MultiSwitch_ESP32/ESP32-MultiSwitch-V2-Projektbeschreibung-v2.00.docx
+++ b/MultiSwitch_ESP32/ESP32-MultiSwitch-V2-Projektbeschreibung-v2.00.docx
@@ -212,6 +212,22 @@
       </w:pPr>
       <w:r>
         <w:t xml:space="preserve">Board: ESP32 (Arduino-Framework). Ein Ausgang je GPIO, PWM über die LEDC-Peripherie. Der WLAN-Access-Point kann beim Booten über einen Pegel an GPIO 13 aktiviert werden oder ab v2.00 zusätzlich jederzeit per Weboberfläche bzw. Auto-Failsafe.</w:t>
+      </w:r>
+    </w:p>
+    <w:p>
+      <w:pPr>
+        <w:spacing w:after="140"/>
+      </w:pPr>
+      <w:r>
+        <w:t xml:space="preserve">Platine und Herkunft: Die Hardware stammt von Der RC-Modellbauer (Frank Verfürth, auf GitHub Ziege-One). Passend ist die ESP32-SBUS-Switch Platine (auch als SMD-Version, positiv oder negativ schaltend).</w:t>
+      </w:r>
+    </w:p>
+    <w:p>
+      <w:pPr>
+        <w:spacing w:after="140"/>
+      </w:pPr>
+      <w:r>
+        <w:t xml:space="preserve">Webseite und Shop: https://derrcmodellbauer.de/  ·  GitHub: https://github.com/Ziege-One (Vorlage ESP32-SBus-Switch: https://github.com/Ziege-One/ESP32-SBus-Switch)  ·  YouTube: https://www.youtube.com/@DerRCModellbauer</w:t>
       </w:r>
     </w:p>
     <w:p>

</xml_diff>